<commit_message>
Sync: L03 F4 response-shape comparison
</commit_message>
<xml_diff>
--- a/labs/L03_Vuln_Scanning_Triage/L03_Worksheet.docx
+++ b/labs/L03_Vuln_Scanning_Triage/L03_Worksheet.docx
@@ -917,7 +917,7 @@
         <w:t>F4 — how do you know?</w:t>
       </w:r>
       <w:r>
-        <w:t xml:space="preserve"> The scanner believed a banner. You didn't. Name the </w:t>
+        <w:t xml:space="preserve"> Both tools believed a banner. You didn't. Name the </w:t>
       </w:r>
       <w:r>
         <w:rPr>
@@ -926,7 +926,15 @@
         <w:t>second, independent signal</w:t>
       </w:r>
       <w:r>
-        <w:t xml:space="preserve"> you used, and say what it showed:</w:t>
+        <w:t xml:space="preserve"> you used, and say what it showed. If you used the response-shape comparison, record the row that gave it away:</w:t>
+      </w:r>
+    </w:p>
+    <w:p>
+      <w:pPr>
+        <w:spacing w:after="120"/>
+      </w:pPr>
+      <w:r>
+        <w:t>____________________________________________________________________________</w:t>
       </w:r>
     </w:p>
     <w:p>

</xml_diff>

<commit_message>
Sync: D2 source hierarchy; L03 method-not-facts framing
</commit_message>
<xml_diff>
--- a/labs/L03_Vuln_Scanning_Triage/L03_Worksheet.docx
+++ b/labs/L03_Vuln_Scanning_Triage/L03_Worksheet.docx
@@ -1168,16 +1168,7 @@
         <w:spacing w:after="120"/>
       </w:pPr>
       <w:r>
-        <w:t xml:space="preserve">Tonight's triaged findings are evidence for </w:t>
-      </w:r>
-      <w:r>
-        <w:rPr>
-          <w:b/>
-        </w:rPr>
-        <w:t>§4 — Risk Assessment</w:t>
-      </w:r>
-      <w:r>
-        <w:t xml:space="preserve">, and they are the kind of thing your </w:t>
+        <w:t xml:space="preserve">What transfers from tonight to your </w:t>
       </w:r>
       <w:r>
         <w:rPr>
@@ -1186,7 +1177,16 @@
         <w:t>D2 risk register</w:t>
       </w:r>
       <w:r>
-        <w:t xml:space="preserve"> is built from: each one can become a row, with an owner and a treatment decision.</w:t>
+        <w:t xml:space="preserve"> is the </w:t>
+      </w:r>
+      <w:r>
+        <w:rPr>
+          <w:b/>
+        </w:rPr>
+        <w:t>method</w:t>
+      </w:r>
+      <w:r>
+        <w:t>, not these findings. This environment is a training range — it isn't your company, and its hosts don't belong on your register. Practise the form here, on what you actually found tonight; then apply the same form to your company's own documented exposures when you write D2.</w:t>
       </w:r>
     </w:p>
     <w:p>
@@ -1203,7 +1203,24 @@
         <w:t>one</w:t>
       </w:r>
       <w:r>
-        <w:t xml:space="preserve"> of tonight's findings and write it as a </w:t>
+        <w:t xml:space="preserve"> of tonight's findings — about </w:t>
+      </w:r>
+      <w:r>
+        <w:rPr>
+          <w:b/>
+        </w:rPr>
+        <w:t>this</w:t>
+      </w:r>
+      <w:r>
+        <w:t xml:space="preserve"> environment — and write it</w:t>
+      </w:r>
+    </w:p>
+    <w:p>
+      <w:pPr>
+        <w:spacing w:after="120"/>
+      </w:pPr>
+      <w:r>
+        <w:t xml:space="preserve">   as a </w:t>
       </w:r>
       <w:r>
         <w:rPr>
@@ -1212,15 +1229,7 @@
         <w:t>risk statement</w:t>
       </w:r>
       <w:r>
-        <w:t xml:space="preserve"> in the</w:t>
-      </w:r>
-    </w:p>
-    <w:p>
-      <w:pPr>
-        <w:spacing w:after="120"/>
-      </w:pPr>
-      <w:r>
-        <w:t xml:space="preserve">   form Tuesday's lecture used — </w:t>
+        <w:t xml:space="preserve"> in the form Tuesday's lecture used: </w:t>
       </w:r>
       <w:r>
         <w:rPr>

</xml_diff>